<commit_message>
Organise project structure and fix analysis scripts - Document contributor names and responsibilities - Update file paths to work from the repository root - Fix injury diagnostic image output - Organise injury analysis files into a dedicated folder
</commit_message>
<xml_diff>
--- a/notes/who_did_what/who_did_what.docx
+++ b/notes/who_did_what/who_did_what.docx
@@ -33,8 +33,8 @@
       </w:tblPr>
       <w:tblGrid>
         <w:gridCol w:w="1428"/>
-        <w:gridCol w:w="1358"/>
-        <w:gridCol w:w="6240"/>
+        <w:gridCol w:w="1333"/>
+        <w:gridCol w:w="6265"/>
       </w:tblGrid>
       <w:tr>
         <w:trPr>
@@ -174,7 +174,15 @@
               <w:cnfStyle w:val="000000000000" w:firstRow="0" w:lastRow="0" w:firstColumn="0" w:lastColumn="0" w:oddVBand="0" w:evenVBand="0" w:oddHBand="0" w:evenHBand="0" w:firstRowFirstColumn="0" w:firstRowLastColumn="0" w:lastRowFirstColumn="0" w:lastRowLastColumn="0"/>
             </w:pPr>
             <w:r>
-              <w:t>Organised the initial project structure and updated the .gitignore to exclude local RStudio settings.</w:t>
+              <w:t>Organised the initial project structure and updated the .</w:t>
+            </w:r>
+            <w:proofErr w:type="spellStart"/>
+            <w:r>
+              <w:t>gitignore</w:t>
+            </w:r>
+            <w:proofErr w:type="spellEnd"/>
+            <w:r>
+              <w:t xml:space="preserve"> to exclude local RStudio settings.</w:t>
             </w:r>
           </w:p>
         </w:tc>
@@ -372,7 +380,7 @@
       <w:tr>
         <w:trPr>
           <w:cnfStyle w:val="000000100000" w:firstRow="0" w:lastRow="0" w:firstColumn="0" w:lastColumn="0" w:oddVBand="0" w:evenVBand="0" w:oddHBand="1" w:evenHBand="0" w:firstRowFirstColumn="0" w:firstRowLastColumn="0" w:lastRowFirstColumn="0" w:lastRowLastColumn="0"/>
-          <w:trHeight w:val="434"/>
+          <w:trHeight w:val="903"/>
         </w:trPr>
         <w:tc>
           <w:tcPr>
@@ -382,8 +390,31 @@
           <w:p>
             <w:pPr>
               <w:jc w:val="center"/>
-            </w:pPr>
-          </w:p>
+              <w:rPr>
+                <w:b w:val="0"/>
+                <w:bCs w:val="0"/>
+              </w:rPr>
+            </w:pPr>
+            <w:r>
+              <w:t>2</w:t>
+            </w:r>
+            <w:r>
+              <w:t>0</w:t>
+            </w:r>
+            <w:r>
+              <w:t>/10/2026</w:t>
+            </w:r>
+          </w:p>
+          <w:p>
+            <w:pPr>
+              <w:jc w:val="center"/>
+              <w:rPr>
+                <w:b w:val="0"/>
+                <w:bCs w:val="0"/>
+              </w:rPr>
+            </w:pPr>
+          </w:p>
+          <w:p/>
         </w:tc>
         <w:tc>
           <w:tcPr>
@@ -394,6 +425,9 @@
               <w:jc w:val="center"/>
               <w:cnfStyle w:val="000000100000" w:firstRow="0" w:lastRow="0" w:firstColumn="0" w:lastColumn="0" w:oddVBand="0" w:evenVBand="0" w:oddHBand="1" w:evenHBand="0" w:firstRowFirstColumn="0" w:firstRowLastColumn="0" w:lastRowFirstColumn="0" w:lastRowLastColumn="0"/>
             </w:pPr>
+            <w:r>
+              <w:t>Rayan Suleman</w:t>
+            </w:r>
           </w:p>
         </w:tc>
         <w:tc>
@@ -404,6 +438,210 @@
             <w:pPr>
               <w:jc w:val="center"/>
               <w:cnfStyle w:val="000000100000" w:firstRow="0" w:lastRow="0" w:firstColumn="0" w:lastColumn="0" w:oddVBand="0" w:evenVBand="0" w:oddHBand="1" w:evenHBand="0" w:firstRowFirstColumn="0" w:firstRowLastColumn="0" w:lastRowFirstColumn="0" w:lastRowLastColumn="0"/>
+            </w:pPr>
+            <w:r>
+              <w:t>Developed a logistic regression model to investigate factors associated with player injuries, calculated odds ratios and confidence intervals, and generated model diagnostic plots.</w:t>
+            </w:r>
+          </w:p>
+        </w:tc>
+      </w:tr>
+      <w:tr>
+        <w:trPr>
+          <w:trHeight w:val="903"/>
+        </w:trPr>
+        <w:tc>
+          <w:tcPr>
+            <w:cnfStyle w:val="001000000000" w:firstRow="0" w:lastRow="0" w:firstColumn="1" w:lastColumn="0" w:oddVBand="0" w:evenVBand="0" w:oddHBand="0" w:evenHBand="0" w:firstRowFirstColumn="0" w:firstRowLastColumn="0" w:lastRowFirstColumn="0" w:lastRowLastColumn="0"/>
+            <w:tcW w:w="0" w:type="auto"/>
+          </w:tcPr>
+          <w:p>
+            <w:pPr>
+              <w:jc w:val="center"/>
+            </w:pPr>
+            <w:r>
+              <w:t>21/10/2026</w:t>
+            </w:r>
+          </w:p>
+        </w:tc>
+        <w:tc>
+          <w:tcPr>
+            <w:tcW w:w="0" w:type="auto"/>
+          </w:tcPr>
+          <w:p>
+            <w:pPr>
+              <w:jc w:val="center"/>
+              <w:cnfStyle w:val="000000000000" w:firstRow="0" w:lastRow="0" w:firstColumn="0" w:lastColumn="0" w:oddVBand="0" w:evenVBand="0" w:oddHBand="0" w:evenHBand="0" w:firstRowFirstColumn="0" w:firstRowLastColumn="0" w:lastRowFirstColumn="0" w:lastRowLastColumn="0"/>
+            </w:pPr>
+            <w:r>
+              <w:t>Daniel Hasani</w:t>
+            </w:r>
+          </w:p>
+        </w:tc>
+        <w:tc>
+          <w:tcPr>
+            <w:tcW w:w="0" w:type="auto"/>
+          </w:tcPr>
+          <w:p>
+            <w:pPr>
+              <w:jc w:val="center"/>
+              <w:cnfStyle w:val="000000000000" w:firstRow="0" w:lastRow="0" w:firstColumn="0" w:lastColumn="0" w:oddVBand="0" w:evenVBand="0" w:oddHBand="0" w:evenHBand="0" w:firstRowFirstColumn="0" w:firstRowLastColumn="0" w:lastRowFirstColumn="0" w:lastRowLastColumn="0"/>
+            </w:pPr>
+            <w:r>
+              <w:t>Fixed the diagnostic image output, reorganised the folder structure, and adapted the code to run correctly from the main repository using relative file paths.</w:t>
+            </w:r>
+          </w:p>
+        </w:tc>
+      </w:tr>
+      <w:tr>
+        <w:trPr>
+          <w:cnfStyle w:val="000000100000" w:firstRow="0" w:lastRow="0" w:firstColumn="0" w:lastColumn="0" w:oddVBand="0" w:evenVBand="0" w:oddHBand="1" w:evenHBand="0" w:firstRowFirstColumn="0" w:firstRowLastColumn="0" w:lastRowFirstColumn="0" w:lastRowLastColumn="0"/>
+          <w:trHeight w:val="903"/>
+        </w:trPr>
+        <w:tc>
+          <w:tcPr>
+            <w:cnfStyle w:val="001000000000" w:firstRow="0" w:lastRow="0" w:firstColumn="1" w:lastColumn="0" w:oddVBand="0" w:evenVBand="0" w:oddHBand="0" w:evenHBand="0" w:firstRowFirstColumn="0" w:firstRowLastColumn="0" w:lastRowFirstColumn="0" w:lastRowLastColumn="0"/>
+            <w:tcW w:w="0" w:type="auto"/>
+          </w:tcPr>
+          <w:p>
+            <w:pPr>
+              <w:jc w:val="center"/>
+            </w:pPr>
+          </w:p>
+        </w:tc>
+        <w:tc>
+          <w:tcPr>
+            <w:tcW w:w="0" w:type="auto"/>
+          </w:tcPr>
+          <w:p>
+            <w:pPr>
+              <w:jc w:val="center"/>
+              <w:cnfStyle w:val="000000100000" w:firstRow="0" w:lastRow="0" w:firstColumn="0" w:lastColumn="0" w:oddVBand="0" w:evenVBand="0" w:oddHBand="1" w:evenHBand="0" w:firstRowFirstColumn="0" w:firstRowLastColumn="0" w:lastRowFirstColumn="0" w:lastRowLastColumn="0"/>
+            </w:pPr>
+          </w:p>
+        </w:tc>
+        <w:tc>
+          <w:tcPr>
+            <w:tcW w:w="0" w:type="auto"/>
+          </w:tcPr>
+          <w:p>
+            <w:pPr>
+              <w:jc w:val="center"/>
+              <w:cnfStyle w:val="000000100000" w:firstRow="0" w:lastRow="0" w:firstColumn="0" w:lastColumn="0" w:oddVBand="0" w:evenVBand="0" w:oddHBand="1" w:evenHBand="0" w:firstRowFirstColumn="0" w:firstRowLastColumn="0" w:lastRowFirstColumn="0" w:lastRowLastColumn="0"/>
+            </w:pPr>
+          </w:p>
+        </w:tc>
+      </w:tr>
+      <w:tr>
+        <w:trPr>
+          <w:trHeight w:val="903"/>
+        </w:trPr>
+        <w:tc>
+          <w:tcPr>
+            <w:cnfStyle w:val="001000000000" w:firstRow="0" w:lastRow="0" w:firstColumn="1" w:lastColumn="0" w:oddVBand="0" w:evenVBand="0" w:oddHBand="0" w:evenHBand="0" w:firstRowFirstColumn="0" w:firstRowLastColumn="0" w:lastRowFirstColumn="0" w:lastRowLastColumn="0"/>
+            <w:tcW w:w="0" w:type="auto"/>
+          </w:tcPr>
+          <w:p>
+            <w:pPr>
+              <w:jc w:val="center"/>
+            </w:pPr>
+          </w:p>
+        </w:tc>
+        <w:tc>
+          <w:tcPr>
+            <w:tcW w:w="0" w:type="auto"/>
+          </w:tcPr>
+          <w:p>
+            <w:pPr>
+              <w:jc w:val="center"/>
+              <w:cnfStyle w:val="000000000000" w:firstRow="0" w:lastRow="0" w:firstColumn="0" w:lastColumn="0" w:oddVBand="0" w:evenVBand="0" w:oddHBand="0" w:evenHBand="0" w:firstRowFirstColumn="0" w:firstRowLastColumn="0" w:lastRowFirstColumn="0" w:lastRowLastColumn="0"/>
+            </w:pPr>
+          </w:p>
+        </w:tc>
+        <w:tc>
+          <w:tcPr>
+            <w:tcW w:w="0" w:type="auto"/>
+          </w:tcPr>
+          <w:p>
+            <w:pPr>
+              <w:jc w:val="center"/>
+              <w:cnfStyle w:val="000000000000" w:firstRow="0" w:lastRow="0" w:firstColumn="0" w:lastColumn="0" w:oddVBand="0" w:evenVBand="0" w:oddHBand="0" w:evenHBand="0" w:firstRowFirstColumn="0" w:firstRowLastColumn="0" w:lastRowFirstColumn="0" w:lastRowLastColumn="0"/>
+            </w:pPr>
+          </w:p>
+        </w:tc>
+      </w:tr>
+      <w:tr>
+        <w:trPr>
+          <w:cnfStyle w:val="000000100000" w:firstRow="0" w:lastRow="0" w:firstColumn="0" w:lastColumn="0" w:oddVBand="0" w:evenVBand="0" w:oddHBand="1" w:evenHBand="0" w:firstRowFirstColumn="0" w:firstRowLastColumn="0" w:lastRowFirstColumn="0" w:lastRowLastColumn="0"/>
+          <w:trHeight w:val="903"/>
+        </w:trPr>
+        <w:tc>
+          <w:tcPr>
+            <w:cnfStyle w:val="001000000000" w:firstRow="0" w:lastRow="0" w:firstColumn="1" w:lastColumn="0" w:oddVBand="0" w:evenVBand="0" w:oddHBand="0" w:evenHBand="0" w:firstRowFirstColumn="0" w:firstRowLastColumn="0" w:lastRowFirstColumn="0" w:lastRowLastColumn="0"/>
+            <w:tcW w:w="0" w:type="auto"/>
+          </w:tcPr>
+          <w:p>
+            <w:pPr>
+              <w:jc w:val="center"/>
+            </w:pPr>
+          </w:p>
+        </w:tc>
+        <w:tc>
+          <w:tcPr>
+            <w:tcW w:w="0" w:type="auto"/>
+          </w:tcPr>
+          <w:p>
+            <w:pPr>
+              <w:jc w:val="center"/>
+              <w:cnfStyle w:val="000000100000" w:firstRow="0" w:lastRow="0" w:firstColumn="0" w:lastColumn="0" w:oddVBand="0" w:evenVBand="0" w:oddHBand="1" w:evenHBand="0" w:firstRowFirstColumn="0" w:firstRowLastColumn="0" w:lastRowFirstColumn="0" w:lastRowLastColumn="0"/>
+            </w:pPr>
+          </w:p>
+        </w:tc>
+        <w:tc>
+          <w:tcPr>
+            <w:tcW w:w="0" w:type="auto"/>
+          </w:tcPr>
+          <w:p>
+            <w:pPr>
+              <w:jc w:val="center"/>
+              <w:cnfStyle w:val="000000100000" w:firstRow="0" w:lastRow="0" w:firstColumn="0" w:lastColumn="0" w:oddVBand="0" w:evenVBand="0" w:oddHBand="1" w:evenHBand="0" w:firstRowFirstColumn="0" w:firstRowLastColumn="0" w:lastRowFirstColumn="0" w:lastRowLastColumn="0"/>
+            </w:pPr>
+          </w:p>
+        </w:tc>
+      </w:tr>
+      <w:tr>
+        <w:trPr>
+          <w:trHeight w:val="903"/>
+        </w:trPr>
+        <w:tc>
+          <w:tcPr>
+            <w:cnfStyle w:val="001000000000" w:firstRow="0" w:lastRow="0" w:firstColumn="1" w:lastColumn="0" w:oddVBand="0" w:evenVBand="0" w:oddHBand="0" w:evenHBand="0" w:firstRowFirstColumn="0" w:firstRowLastColumn="0" w:lastRowFirstColumn="0" w:lastRowLastColumn="0"/>
+            <w:tcW w:w="0" w:type="auto"/>
+          </w:tcPr>
+          <w:p>
+            <w:pPr>
+              <w:jc w:val="center"/>
+            </w:pPr>
+          </w:p>
+        </w:tc>
+        <w:tc>
+          <w:tcPr>
+            <w:tcW w:w="0" w:type="auto"/>
+          </w:tcPr>
+          <w:p>
+            <w:pPr>
+              <w:jc w:val="center"/>
+              <w:cnfStyle w:val="000000000000" w:firstRow="0" w:lastRow="0" w:firstColumn="0" w:lastColumn="0" w:oddVBand="0" w:evenVBand="0" w:oddHBand="0" w:evenHBand="0" w:firstRowFirstColumn="0" w:firstRowLastColumn="0" w:lastRowFirstColumn="0" w:lastRowLastColumn="0"/>
+            </w:pPr>
+          </w:p>
+        </w:tc>
+        <w:tc>
+          <w:tcPr>
+            <w:tcW w:w="0" w:type="auto"/>
+          </w:tcPr>
+          <w:p>
+            <w:pPr>
+              <w:jc w:val="center"/>
+              <w:cnfStyle w:val="000000000000" w:firstRow="0" w:lastRow="0" w:firstColumn="0" w:lastColumn="0" w:oddVBand="0" w:evenVBand="0" w:oddHBand="0" w:evenHBand="0" w:firstRowFirstColumn="0" w:firstRowLastColumn="0" w:lastRowFirstColumn="0" w:lastRowLastColumn="0"/>
             </w:pPr>
           </w:p>
         </w:tc>

</xml_diff>

<commit_message>
Updated the who_did_what document to add last commit. Added graphical outputs to the output folder
</commit_message>
<xml_diff>
--- a/notes/who_did_what/who_did_what.docx
+++ b/notes/who_did_what/who_did_what.docx
@@ -28,13 +28,13 @@
       <w:tblPr>
         <w:tblStyle w:val="GridTable2"/>
         <w:tblpPr w:leftFromText="180" w:rightFromText="180" w:vertAnchor="text" w:horzAnchor="margin" w:tblpXSpec="center" w:tblpY="370"/>
-        <w:tblW w:w="0" w:type="auto"/>
+        <w:tblW w:w="5000" w:type="pct"/>
         <w:tblLook w:val="04A0" w:firstRow="1" w:lastRow="0" w:firstColumn="1" w:lastColumn="0" w:noHBand="0" w:noVBand="1"/>
       </w:tblPr>
       <w:tblGrid>
-        <w:gridCol w:w="1428"/>
-        <w:gridCol w:w="1359"/>
-        <w:gridCol w:w="6239"/>
+        <w:gridCol w:w="1525"/>
+        <w:gridCol w:w="1336"/>
+        <w:gridCol w:w="6777"/>
       </w:tblGrid>
       <w:tr>
         <w:trPr>
@@ -44,7 +44,7 @@
         <w:tc>
           <w:tcPr>
             <w:cnfStyle w:val="001000000000" w:firstRow="0" w:lastRow="0" w:firstColumn="1" w:lastColumn="0" w:oddVBand="0" w:evenVBand="0" w:oddHBand="0" w:evenHBand="0" w:firstRowFirstColumn="0" w:firstRowLastColumn="0" w:lastRowFirstColumn="0" w:lastRowLastColumn="0"/>
-            <w:tcW w:w="0" w:type="auto"/>
+            <w:tcW w:w="791" w:type="pct"/>
           </w:tcPr>
           <w:p>
             <w:pPr>
@@ -57,7 +57,7 @@
         </w:tc>
         <w:tc>
           <w:tcPr>
-            <w:tcW w:w="0" w:type="auto"/>
+            <w:tcW w:w="693" w:type="pct"/>
           </w:tcPr>
           <w:p>
             <w:pPr>
@@ -71,7 +71,7 @@
         </w:tc>
         <w:tc>
           <w:tcPr>
-            <w:tcW w:w="0" w:type="auto"/>
+            <w:tcW w:w="3516" w:type="pct"/>
           </w:tcPr>
           <w:p>
             <w:pPr>
@@ -92,7 +92,7 @@
         <w:tc>
           <w:tcPr>
             <w:cnfStyle w:val="001000000000" w:firstRow="0" w:lastRow="0" w:firstColumn="1" w:lastColumn="0" w:oddVBand="0" w:evenVBand="0" w:oddHBand="0" w:evenHBand="0" w:firstRowFirstColumn="0" w:firstRowLastColumn="0" w:lastRowFirstColumn="0" w:lastRowLastColumn="0"/>
-            <w:tcW w:w="0" w:type="auto"/>
+            <w:tcW w:w="791" w:type="pct"/>
           </w:tcPr>
           <w:p>
             <w:pPr>
@@ -105,7 +105,7 @@
         </w:tc>
         <w:tc>
           <w:tcPr>
-            <w:tcW w:w="0" w:type="auto"/>
+            <w:tcW w:w="693" w:type="pct"/>
           </w:tcPr>
           <w:p>
             <w:pPr>
@@ -119,7 +119,7 @@
         </w:tc>
         <w:tc>
           <w:tcPr>
-            <w:tcW w:w="0" w:type="auto"/>
+            <w:tcW w:w="3516" w:type="pct"/>
           </w:tcPr>
           <w:p>
             <w:pPr>
@@ -139,7 +139,7 @@
         <w:tc>
           <w:tcPr>
             <w:cnfStyle w:val="001000000000" w:firstRow="0" w:lastRow="0" w:firstColumn="1" w:lastColumn="0" w:oddVBand="0" w:evenVBand="0" w:oddHBand="0" w:evenHBand="0" w:firstRowFirstColumn="0" w:firstRowLastColumn="0" w:lastRowFirstColumn="0" w:lastRowLastColumn="0"/>
-            <w:tcW w:w="0" w:type="auto"/>
+            <w:tcW w:w="791" w:type="pct"/>
           </w:tcPr>
           <w:p>
             <w:pPr>
@@ -152,7 +152,7 @@
         </w:tc>
         <w:tc>
           <w:tcPr>
-            <w:tcW w:w="0" w:type="auto"/>
+            <w:tcW w:w="693" w:type="pct"/>
           </w:tcPr>
           <w:p>
             <w:pPr>
@@ -166,7 +166,7 @@
         </w:tc>
         <w:tc>
           <w:tcPr>
-            <w:tcW w:w="0" w:type="auto"/>
+            <w:tcW w:w="3516" w:type="pct"/>
           </w:tcPr>
           <w:p>
             <w:pPr>
@@ -187,7 +187,7 @@
         <w:tc>
           <w:tcPr>
             <w:cnfStyle w:val="001000000000" w:firstRow="0" w:lastRow="0" w:firstColumn="1" w:lastColumn="0" w:oddVBand="0" w:evenVBand="0" w:oddHBand="0" w:evenHBand="0" w:firstRowFirstColumn="0" w:firstRowLastColumn="0" w:lastRowFirstColumn="0" w:lastRowLastColumn="0"/>
-            <w:tcW w:w="0" w:type="auto"/>
+            <w:tcW w:w="791" w:type="pct"/>
           </w:tcPr>
           <w:p>
             <w:pPr>
@@ -200,7 +200,7 @@
         </w:tc>
         <w:tc>
           <w:tcPr>
-            <w:tcW w:w="0" w:type="auto"/>
+            <w:tcW w:w="693" w:type="pct"/>
           </w:tcPr>
           <w:p>
             <w:pPr>
@@ -214,7 +214,7 @@
         </w:tc>
         <w:tc>
           <w:tcPr>
-            <w:tcW w:w="0" w:type="auto"/>
+            <w:tcW w:w="3516" w:type="pct"/>
           </w:tcPr>
           <w:p>
             <w:pPr>
@@ -234,7 +234,7 @@
         <w:tc>
           <w:tcPr>
             <w:cnfStyle w:val="001000000000" w:firstRow="0" w:lastRow="0" w:firstColumn="1" w:lastColumn="0" w:oddVBand="0" w:evenVBand="0" w:oddHBand="0" w:evenHBand="0" w:firstRowFirstColumn="0" w:firstRowLastColumn="0" w:lastRowFirstColumn="0" w:lastRowLastColumn="0"/>
-            <w:tcW w:w="0" w:type="auto"/>
+            <w:tcW w:w="791" w:type="pct"/>
           </w:tcPr>
           <w:p>
             <w:pPr>
@@ -247,7 +247,7 @@
         </w:tc>
         <w:tc>
           <w:tcPr>
-            <w:tcW w:w="0" w:type="auto"/>
+            <w:tcW w:w="693" w:type="pct"/>
           </w:tcPr>
           <w:p>
             <w:pPr>
@@ -261,7 +261,7 @@
         </w:tc>
         <w:tc>
           <w:tcPr>
-            <w:tcW w:w="0" w:type="auto"/>
+            <w:tcW w:w="3516" w:type="pct"/>
           </w:tcPr>
           <w:p>
             <w:pPr>
@@ -282,7 +282,7 @@
         <w:tc>
           <w:tcPr>
             <w:cnfStyle w:val="001000000000" w:firstRow="0" w:lastRow="0" w:firstColumn="1" w:lastColumn="0" w:oddVBand="0" w:evenVBand="0" w:oddHBand="0" w:evenHBand="0" w:firstRowFirstColumn="0" w:firstRowLastColumn="0" w:lastRowFirstColumn="0" w:lastRowLastColumn="0"/>
-            <w:tcW w:w="0" w:type="auto"/>
+            <w:tcW w:w="791" w:type="pct"/>
           </w:tcPr>
           <w:p>
             <w:pPr>
@@ -295,7 +295,7 @@
         </w:tc>
         <w:tc>
           <w:tcPr>
-            <w:tcW w:w="0" w:type="auto"/>
+            <w:tcW w:w="693" w:type="pct"/>
           </w:tcPr>
           <w:p>
             <w:pPr>
@@ -309,7 +309,7 @@
         </w:tc>
         <w:tc>
           <w:tcPr>
-            <w:tcW w:w="0" w:type="auto"/>
+            <w:tcW w:w="3516" w:type="pct"/>
           </w:tcPr>
           <w:p>
             <w:pPr>
@@ -329,7 +329,7 @@
         <w:tc>
           <w:tcPr>
             <w:cnfStyle w:val="001000000000" w:firstRow="0" w:lastRow="0" w:firstColumn="1" w:lastColumn="0" w:oddVBand="0" w:evenVBand="0" w:oddHBand="0" w:evenHBand="0" w:firstRowFirstColumn="0" w:firstRowLastColumn="0" w:lastRowFirstColumn="0" w:lastRowLastColumn="0"/>
-            <w:tcW w:w="0" w:type="auto"/>
+            <w:tcW w:w="791" w:type="pct"/>
           </w:tcPr>
           <w:p>
             <w:pPr>
@@ -342,7 +342,7 @@
         </w:tc>
         <w:tc>
           <w:tcPr>
-            <w:tcW w:w="0" w:type="auto"/>
+            <w:tcW w:w="693" w:type="pct"/>
           </w:tcPr>
           <w:p>
             <w:pPr>
@@ -356,7 +356,7 @@
         </w:tc>
         <w:tc>
           <w:tcPr>
-            <w:tcW w:w="0" w:type="auto"/>
+            <w:tcW w:w="3516" w:type="pct"/>
           </w:tcPr>
           <w:p>
             <w:pPr>
@@ -377,7 +377,7 @@
         <w:tc>
           <w:tcPr>
             <w:cnfStyle w:val="001000000000" w:firstRow="0" w:lastRow="0" w:firstColumn="1" w:lastColumn="0" w:oddVBand="0" w:evenVBand="0" w:oddHBand="0" w:evenHBand="0" w:firstRowFirstColumn="0" w:firstRowLastColumn="0" w:lastRowFirstColumn="0" w:lastRowLastColumn="0"/>
-            <w:tcW w:w="0" w:type="auto"/>
+            <w:tcW w:w="791" w:type="pct"/>
           </w:tcPr>
           <w:p>
             <w:pPr>
@@ -400,7 +400,7 @@
         </w:tc>
         <w:tc>
           <w:tcPr>
-            <w:tcW w:w="0" w:type="auto"/>
+            <w:tcW w:w="693" w:type="pct"/>
           </w:tcPr>
           <w:p>
             <w:pPr>
@@ -414,7 +414,7 @@
         </w:tc>
         <w:tc>
           <w:tcPr>
-            <w:tcW w:w="0" w:type="auto"/>
+            <w:tcW w:w="3516" w:type="pct"/>
           </w:tcPr>
           <w:p>
             <w:pPr>
@@ -425,16 +425,309 @@
               <w:t>Analysed injury record by</w:t>
             </w:r>
             <w:r>
-              <w:t xml:space="preserve"> implementing the binomial GLM for player injury data, along with odds ratio calculations and residual diagnostics.</w:t>
-            </w:r>
+              <w:t xml:space="preserve"> implementing the binomial GLM for player injury data, along with odds ratio calculations and residual diagnostics</w:t>
+            </w:r>
+            <w:r>
+              <w:t>.</w:t>
+            </w:r>
+          </w:p>
+        </w:tc>
+      </w:tr>
+      <w:tr>
+        <w:trPr>
+          <w:trHeight w:val="434"/>
+        </w:trPr>
+        <w:tc>
+          <w:tcPr>
+            <w:cnfStyle w:val="001000000000" w:firstRow="0" w:lastRow="0" w:firstColumn="1" w:lastColumn="0" w:oddVBand="0" w:evenVBand="0" w:oddHBand="0" w:evenHBand="0" w:firstRowFirstColumn="0" w:firstRowLastColumn="0" w:lastRowFirstColumn="0" w:lastRowLastColumn="0"/>
+            <w:tcW w:w="791" w:type="pct"/>
+          </w:tcPr>
+          <w:p>
+            <w:pPr>
+              <w:jc w:val="center"/>
+            </w:pPr>
+            <w:r>
+              <w:t>29/10/2026</w:t>
+            </w:r>
+          </w:p>
+        </w:tc>
+        <w:tc>
+          <w:tcPr>
+            <w:tcW w:w="693" w:type="pct"/>
+          </w:tcPr>
+          <w:p>
+            <w:pPr>
+              <w:jc w:val="center"/>
+              <w:cnfStyle w:val="000000000000" w:firstRow="0" w:lastRow="0" w:firstColumn="0" w:lastColumn="0" w:oddVBand="0" w:evenVBand="0" w:oddHBand="0" w:evenHBand="0" w:firstRowFirstColumn="0" w:firstRowLastColumn="0" w:lastRowFirstColumn="0" w:lastRowLastColumn="0"/>
+            </w:pPr>
+            <w:r>
+              <w:t>Daniel Hasani</w:t>
+            </w:r>
+          </w:p>
+        </w:tc>
+        <w:tc>
+          <w:tcPr>
+            <w:tcW w:w="3516" w:type="pct"/>
+          </w:tcPr>
+          <w:p>
+            <w:pPr>
+              <w:jc w:val="center"/>
+              <w:cnfStyle w:val="000000000000" w:firstRow="0" w:lastRow="0" w:firstColumn="0" w:lastColumn="0" w:oddVBand="0" w:evenVBand="0" w:oddHBand="0" w:evenHBand="0" w:firstRowFirstColumn="0" w:firstRowLastColumn="0" w:lastRowFirstColumn="0" w:lastRowLastColumn="0"/>
+            </w:pPr>
+            <w:r>
+              <w:t>Added Week 4 linear regression and residual diagnostics for Ashford match goals</w:t>
+            </w:r>
+            <w:r>
+              <w:t>,</w:t>
+            </w:r>
+            <w:r>
+              <w:t xml:space="preserve"> a Week 5 Poisson and quasi-Poisson analysis of previous injury counts and a Week 6/8 binomial logistic regression </w:t>
+            </w:r>
+            <w:r>
+              <w:t xml:space="preserve">with </w:t>
+            </w:r>
+            <w:r>
+              <w:t>chi-squared test of player injury status by position.</w:t>
+            </w:r>
+          </w:p>
+        </w:tc>
+      </w:tr>
+      <w:tr>
+        <w:trPr>
+          <w:cnfStyle w:val="000000100000" w:firstRow="0" w:lastRow="0" w:firstColumn="0" w:lastColumn="0" w:oddVBand="0" w:evenVBand="0" w:oddHBand="1" w:evenHBand="0" w:firstRowFirstColumn="0" w:firstRowLastColumn="0" w:lastRowFirstColumn="0" w:lastRowLastColumn="0"/>
+          <w:trHeight w:val="434"/>
+        </w:trPr>
+        <w:tc>
+          <w:tcPr>
+            <w:cnfStyle w:val="001000000000" w:firstRow="0" w:lastRow="0" w:firstColumn="1" w:lastColumn="0" w:oddVBand="0" w:evenVBand="0" w:oddHBand="0" w:evenHBand="0" w:firstRowFirstColumn="0" w:firstRowLastColumn="0" w:lastRowFirstColumn="0" w:lastRowLastColumn="0"/>
+            <w:tcW w:w="791" w:type="pct"/>
+          </w:tcPr>
+          <w:p>
+            <w:pPr>
+              <w:jc w:val="center"/>
+            </w:pPr>
+          </w:p>
+        </w:tc>
+        <w:tc>
+          <w:tcPr>
+            <w:tcW w:w="693" w:type="pct"/>
+          </w:tcPr>
+          <w:p>
+            <w:pPr>
+              <w:jc w:val="center"/>
+              <w:cnfStyle w:val="000000100000" w:firstRow="0" w:lastRow="0" w:firstColumn="0" w:lastColumn="0" w:oddVBand="0" w:evenVBand="0" w:oddHBand="1" w:evenHBand="0" w:firstRowFirstColumn="0" w:firstRowLastColumn="0" w:lastRowFirstColumn="0" w:lastRowLastColumn="0"/>
+            </w:pPr>
+          </w:p>
+        </w:tc>
+        <w:tc>
+          <w:tcPr>
+            <w:tcW w:w="3516" w:type="pct"/>
+          </w:tcPr>
+          <w:p>
+            <w:pPr>
+              <w:jc w:val="center"/>
+              <w:cnfStyle w:val="000000100000" w:firstRow="0" w:lastRow="0" w:firstColumn="0" w:lastColumn="0" w:oddVBand="0" w:evenVBand="0" w:oddHBand="1" w:evenHBand="0" w:firstRowFirstColumn="0" w:firstRowLastColumn="0" w:lastRowFirstColumn="0" w:lastRowLastColumn="0"/>
+            </w:pPr>
+          </w:p>
+        </w:tc>
+      </w:tr>
+      <w:tr>
+        <w:trPr>
+          <w:trHeight w:val="434"/>
+        </w:trPr>
+        <w:tc>
+          <w:tcPr>
+            <w:cnfStyle w:val="001000000000" w:firstRow="0" w:lastRow="0" w:firstColumn="1" w:lastColumn="0" w:oddVBand="0" w:evenVBand="0" w:oddHBand="0" w:evenHBand="0" w:firstRowFirstColumn="0" w:firstRowLastColumn="0" w:lastRowFirstColumn="0" w:lastRowLastColumn="0"/>
+            <w:tcW w:w="791" w:type="pct"/>
+          </w:tcPr>
+          <w:p>
+            <w:pPr>
+              <w:jc w:val="center"/>
+            </w:pPr>
+          </w:p>
+        </w:tc>
+        <w:tc>
+          <w:tcPr>
+            <w:tcW w:w="693" w:type="pct"/>
+          </w:tcPr>
+          <w:p>
+            <w:pPr>
+              <w:jc w:val="center"/>
+              <w:cnfStyle w:val="000000000000" w:firstRow="0" w:lastRow="0" w:firstColumn="0" w:lastColumn="0" w:oddVBand="0" w:evenVBand="0" w:oddHBand="0" w:evenHBand="0" w:firstRowFirstColumn="0" w:firstRowLastColumn="0" w:lastRowFirstColumn="0" w:lastRowLastColumn="0"/>
+            </w:pPr>
+          </w:p>
+        </w:tc>
+        <w:tc>
+          <w:tcPr>
+            <w:tcW w:w="3516" w:type="pct"/>
+          </w:tcPr>
+          <w:p>
+            <w:pPr>
+              <w:jc w:val="center"/>
+              <w:cnfStyle w:val="000000000000" w:firstRow="0" w:lastRow="0" w:firstColumn="0" w:lastColumn="0" w:oddVBand="0" w:evenVBand="0" w:oddHBand="0" w:evenHBand="0" w:firstRowFirstColumn="0" w:firstRowLastColumn="0" w:lastRowFirstColumn="0" w:lastRowLastColumn="0"/>
+            </w:pPr>
+          </w:p>
+        </w:tc>
+      </w:tr>
+      <w:tr>
+        <w:trPr>
+          <w:cnfStyle w:val="000000100000" w:firstRow="0" w:lastRow="0" w:firstColumn="0" w:lastColumn="0" w:oddVBand="0" w:evenVBand="0" w:oddHBand="1" w:evenHBand="0" w:firstRowFirstColumn="0" w:firstRowLastColumn="0" w:lastRowFirstColumn="0" w:lastRowLastColumn="0"/>
+          <w:trHeight w:val="434"/>
+        </w:trPr>
+        <w:tc>
+          <w:tcPr>
+            <w:cnfStyle w:val="001000000000" w:firstRow="0" w:lastRow="0" w:firstColumn="1" w:lastColumn="0" w:oddVBand="0" w:evenVBand="0" w:oddHBand="0" w:evenHBand="0" w:firstRowFirstColumn="0" w:firstRowLastColumn="0" w:lastRowFirstColumn="0" w:lastRowLastColumn="0"/>
+            <w:tcW w:w="791" w:type="pct"/>
+          </w:tcPr>
+          <w:p>
+            <w:pPr>
+              <w:jc w:val="center"/>
+            </w:pPr>
+          </w:p>
+        </w:tc>
+        <w:tc>
+          <w:tcPr>
+            <w:tcW w:w="693" w:type="pct"/>
+          </w:tcPr>
+          <w:p>
+            <w:pPr>
+              <w:jc w:val="center"/>
+              <w:cnfStyle w:val="000000100000" w:firstRow="0" w:lastRow="0" w:firstColumn="0" w:lastColumn="0" w:oddVBand="0" w:evenVBand="0" w:oddHBand="1" w:evenHBand="0" w:firstRowFirstColumn="0" w:firstRowLastColumn="0" w:lastRowFirstColumn="0" w:lastRowLastColumn="0"/>
+            </w:pPr>
+          </w:p>
+        </w:tc>
+        <w:tc>
+          <w:tcPr>
+            <w:tcW w:w="3516" w:type="pct"/>
+          </w:tcPr>
+          <w:p>
+            <w:pPr>
+              <w:jc w:val="center"/>
+              <w:cnfStyle w:val="000000100000" w:firstRow="0" w:lastRow="0" w:firstColumn="0" w:lastColumn="0" w:oddVBand="0" w:evenVBand="0" w:oddHBand="1" w:evenHBand="0" w:firstRowFirstColumn="0" w:firstRowLastColumn="0" w:lastRowFirstColumn="0" w:lastRowLastColumn="0"/>
+            </w:pPr>
+          </w:p>
+        </w:tc>
+      </w:tr>
+      <w:tr>
+        <w:trPr>
+          <w:trHeight w:val="434"/>
+        </w:trPr>
+        <w:tc>
+          <w:tcPr>
+            <w:cnfStyle w:val="001000000000" w:firstRow="0" w:lastRow="0" w:firstColumn="1" w:lastColumn="0" w:oddVBand="0" w:evenVBand="0" w:oddHBand="0" w:evenHBand="0" w:firstRowFirstColumn="0" w:firstRowLastColumn="0" w:lastRowFirstColumn="0" w:lastRowLastColumn="0"/>
+            <w:tcW w:w="791" w:type="pct"/>
+          </w:tcPr>
+          <w:p>
+            <w:pPr>
+              <w:jc w:val="center"/>
+            </w:pPr>
+          </w:p>
+        </w:tc>
+        <w:tc>
+          <w:tcPr>
+            <w:tcW w:w="693" w:type="pct"/>
+          </w:tcPr>
+          <w:p>
+            <w:pPr>
+              <w:jc w:val="center"/>
+              <w:cnfStyle w:val="000000000000" w:firstRow="0" w:lastRow="0" w:firstColumn="0" w:lastColumn="0" w:oddVBand="0" w:evenVBand="0" w:oddHBand="0" w:evenHBand="0" w:firstRowFirstColumn="0" w:firstRowLastColumn="0" w:lastRowFirstColumn="0" w:lastRowLastColumn="0"/>
+            </w:pPr>
+          </w:p>
+        </w:tc>
+        <w:tc>
+          <w:tcPr>
+            <w:tcW w:w="3516" w:type="pct"/>
+          </w:tcPr>
+          <w:p>
+            <w:pPr>
+              <w:jc w:val="center"/>
+              <w:cnfStyle w:val="000000000000" w:firstRow="0" w:lastRow="0" w:firstColumn="0" w:lastColumn="0" w:oddVBand="0" w:evenVBand="0" w:oddHBand="0" w:evenHBand="0" w:firstRowFirstColumn="0" w:firstRowLastColumn="0" w:lastRowFirstColumn="0" w:lastRowLastColumn="0"/>
+            </w:pPr>
+          </w:p>
+        </w:tc>
+      </w:tr>
+      <w:tr>
+        <w:trPr>
+          <w:cnfStyle w:val="000000100000" w:firstRow="0" w:lastRow="0" w:firstColumn="0" w:lastColumn="0" w:oddVBand="0" w:evenVBand="0" w:oddHBand="1" w:evenHBand="0" w:firstRowFirstColumn="0" w:firstRowLastColumn="0" w:lastRowFirstColumn="0" w:lastRowLastColumn="0"/>
+          <w:trHeight w:val="434"/>
+        </w:trPr>
+        <w:tc>
+          <w:tcPr>
+            <w:cnfStyle w:val="001000000000" w:firstRow="0" w:lastRow="0" w:firstColumn="1" w:lastColumn="0" w:oddVBand="0" w:evenVBand="0" w:oddHBand="0" w:evenHBand="0" w:firstRowFirstColumn="0" w:firstRowLastColumn="0" w:lastRowFirstColumn="0" w:lastRowLastColumn="0"/>
+            <w:tcW w:w="791" w:type="pct"/>
+          </w:tcPr>
+          <w:p>
+            <w:pPr>
+              <w:jc w:val="center"/>
+            </w:pPr>
+          </w:p>
+        </w:tc>
+        <w:tc>
+          <w:tcPr>
+            <w:tcW w:w="693" w:type="pct"/>
+          </w:tcPr>
+          <w:p>
+            <w:pPr>
+              <w:jc w:val="center"/>
+              <w:cnfStyle w:val="000000100000" w:firstRow="0" w:lastRow="0" w:firstColumn="0" w:lastColumn="0" w:oddVBand="0" w:evenVBand="0" w:oddHBand="1" w:evenHBand="0" w:firstRowFirstColumn="0" w:firstRowLastColumn="0" w:lastRowFirstColumn="0" w:lastRowLastColumn="0"/>
+            </w:pPr>
+          </w:p>
+        </w:tc>
+        <w:tc>
+          <w:tcPr>
+            <w:tcW w:w="3516" w:type="pct"/>
+          </w:tcPr>
+          <w:p>
+            <w:pPr>
+              <w:jc w:val="center"/>
+              <w:cnfStyle w:val="000000100000" w:firstRow="0" w:lastRow="0" w:firstColumn="0" w:lastColumn="0" w:oddVBand="0" w:evenVBand="0" w:oddHBand="1" w:evenHBand="0" w:firstRowFirstColumn="0" w:firstRowLastColumn="0" w:lastRowFirstColumn="0" w:lastRowLastColumn="0"/>
+            </w:pPr>
+          </w:p>
+        </w:tc>
+      </w:tr>
+      <w:tr>
+        <w:trPr>
+          <w:trHeight w:val="434"/>
+        </w:trPr>
+        <w:tc>
+          <w:tcPr>
+            <w:cnfStyle w:val="001000000000" w:firstRow="0" w:lastRow="0" w:firstColumn="1" w:lastColumn="0" w:oddVBand="0" w:evenVBand="0" w:oddHBand="0" w:evenHBand="0" w:firstRowFirstColumn="0" w:firstRowLastColumn="0" w:lastRowFirstColumn="0" w:lastRowLastColumn="0"/>
+            <w:tcW w:w="791" w:type="pct"/>
+          </w:tcPr>
+          <w:p>
+            <w:pPr>
+              <w:jc w:val="center"/>
+            </w:pPr>
+          </w:p>
+        </w:tc>
+        <w:tc>
+          <w:tcPr>
+            <w:tcW w:w="693" w:type="pct"/>
+          </w:tcPr>
+          <w:p>
+            <w:pPr>
+              <w:jc w:val="center"/>
+              <w:cnfStyle w:val="000000000000" w:firstRow="0" w:lastRow="0" w:firstColumn="0" w:lastColumn="0" w:oddVBand="0" w:evenVBand="0" w:oddHBand="0" w:evenHBand="0" w:firstRowFirstColumn="0" w:firstRowLastColumn="0" w:lastRowFirstColumn="0" w:lastRowLastColumn="0"/>
+            </w:pPr>
+          </w:p>
+        </w:tc>
+        <w:tc>
+          <w:tcPr>
+            <w:tcW w:w="3516" w:type="pct"/>
+          </w:tcPr>
+          <w:p>
+            <w:pPr>
+              <w:jc w:val="center"/>
+              <w:cnfStyle w:val="000000000000" w:firstRow="0" w:lastRow="0" w:firstColumn="0" w:lastColumn="0" w:oddVBand="0" w:evenVBand="0" w:oddHBand="0" w:evenHBand="0" w:firstRowFirstColumn="0" w:firstRowLastColumn="0" w:lastRowFirstColumn="0" w:lastRowLastColumn="0"/>
+            </w:pPr>
           </w:p>
         </w:tc>
       </w:tr>
     </w:tbl>
     <w:p/>
     <w:sectPr>
-      <w:pgSz w:w="11906" w:h="16838"/>
-      <w:pgMar w:top="1440" w:right="1440" w:bottom="1440" w:left="1440" w:header="708" w:footer="708" w:gutter="0"/>
+      <w:pgSz w:w="11906" w:h="16838" w:code="9"/>
+      <w:pgMar w:top="1134" w:right="1134" w:bottom="1134" w:left="1134" w:header="709" w:footer="709" w:gutter="0"/>
       <w:cols w:space="708"/>
       <w:docGrid w:linePitch="360"/>
     </w:sectPr>

</xml_diff>